<commit_message>
feat: agregar modelo de seguimiento y solicitud de falla, y crear estructura de la aplicación 'solicitudes'
</commit_message>
<xml_diff>
--- a/docs/MODELO ENTIDAD RELACION.docx
+++ b/docs/MODELO ENTIDAD RELACION.docx
@@ -8418,6 +8418,13 @@
           <w:bCs/>
         </w:rPr>
       </w:pPr>
+      <w:r>
+        <w:rPr>
+          <w:b/>
+          <w:bCs/>
+        </w:rPr>
+        <w:t xml:space="preserve">CAMBIIOS </w:t>
+      </w:r>
     </w:p>
     <w:p>
       <w:pPr>
@@ -8436,8 +8443,35 @@
         <w:rPr>
           <w:b/>
           <w:bCs/>
-        </w:rPr>
-      </w:pPr>
+          <w:lang w:val="es-MX"/>
+        </w:rPr>
+      </w:pPr>
+      <w:r>
+        <w:rPr>
+          <w:b/>
+          <w:bCs/>
+          <w:lang w:val="es-MX"/>
+        </w:rPr>
+        <w:t xml:space="preserve">Seguimiento </w:t>
+      </w:r>
+      <w:proofErr w:type="spellStart"/>
+      <w:r>
+        <w:rPr>
+          <w:b/>
+          <w:bCs/>
+          <w:lang w:val="es-MX"/>
+        </w:rPr>
+        <w:t>quedaria</w:t>
+      </w:r>
+      <w:proofErr w:type="spellEnd"/>
+      <w:r>
+        <w:rPr>
+          <w:b/>
+          <w:bCs/>
+          <w:lang w:val="es-MX"/>
+        </w:rPr>
+        <w:t xml:space="preserve">: </w:t>
+      </w:r>
     </w:p>
     <w:p>
       <w:pPr>
@@ -8446,8 +8480,17 @@
         <w:rPr>
           <w:b/>
           <w:bCs/>
-        </w:rPr>
-      </w:pPr>
+          <w:lang w:val="es-MX"/>
+        </w:rPr>
+      </w:pPr>
+      <w:r>
+        <w:rPr>
+          <w:b/>
+          <w:bCs/>
+          <w:lang w:val="es-MX"/>
+        </w:rPr>
+        <w:t> </w:t>
+      </w:r>
     </w:p>
     <w:p>
       <w:pPr>
@@ -8456,8 +8499,17 @@
         <w:rPr>
           <w:b/>
           <w:bCs/>
-        </w:rPr>
-      </w:pPr>
+          <w:lang w:val="es-MX"/>
+        </w:rPr>
+      </w:pPr>
+      <w:r>
+        <w:rPr>
+          <w:b/>
+          <w:bCs/>
+          <w:lang w:val="es-MX"/>
+        </w:rPr>
+        <w:t>SEGUIMIENTO_SOLICITUD</w:t>
+      </w:r>
     </w:p>
     <w:p>
       <w:pPr>
@@ -8466,8 +8518,17 @@
         <w:rPr>
           <w:b/>
           <w:bCs/>
-        </w:rPr>
-      </w:pPr>
+          <w:lang w:val="es-MX"/>
+        </w:rPr>
+      </w:pPr>
+      <w:r>
+        <w:rPr>
+          <w:b/>
+          <w:bCs/>
+          <w:lang w:val="es-MX"/>
+        </w:rPr>
+        <w:t>-------------------------</w:t>
+      </w:r>
     </w:p>
     <w:p>
       <w:pPr>
@@ -8476,8 +8537,27 @@
         <w:rPr>
           <w:b/>
           <w:bCs/>
-        </w:rPr>
-      </w:pPr>
+          <w:lang w:val="es-MX"/>
+        </w:rPr>
+      </w:pPr>
+      <w:proofErr w:type="spellStart"/>
+      <w:r>
+        <w:rPr>
+          <w:b/>
+          <w:bCs/>
+          <w:lang w:val="es-MX"/>
+        </w:rPr>
+        <w:t>idSeguimiento</w:t>
+      </w:r>
+      <w:proofErr w:type="spellEnd"/>
+      <w:r>
+        <w:rPr>
+          <w:b/>
+          <w:bCs/>
+          <w:lang w:val="es-MX"/>
+        </w:rPr>
+        <w:t xml:space="preserve"> (PK)</w:t>
+      </w:r>
     </w:p>
     <w:p>
       <w:pPr>
@@ -8486,8 +8566,17 @@
         <w:rPr>
           <w:b/>
           <w:bCs/>
-        </w:rPr>
-      </w:pPr>
+          <w:lang w:val="es-MX"/>
+        </w:rPr>
+      </w:pPr>
+      <w:r>
+        <w:rPr>
+          <w:b/>
+          <w:bCs/>
+          <w:lang w:val="es-MX"/>
+        </w:rPr>
+        <w:t> </w:t>
+      </w:r>
     </w:p>
     <w:p>
       <w:pPr>
@@ -8496,8 +8585,27 @@
         <w:rPr>
           <w:b/>
           <w:bCs/>
-        </w:rPr>
-      </w:pPr>
+          <w:lang w:val="es-MX"/>
+        </w:rPr>
+      </w:pPr>
+      <w:proofErr w:type="spellStart"/>
+      <w:r>
+        <w:rPr>
+          <w:b/>
+          <w:bCs/>
+          <w:lang w:val="es-MX"/>
+        </w:rPr>
+        <w:t>idSolicitud</w:t>
+      </w:r>
+      <w:proofErr w:type="spellEnd"/>
+      <w:r>
+        <w:rPr>
+          <w:b/>
+          <w:bCs/>
+          <w:lang w:val="es-MX"/>
+        </w:rPr>
+        <w:t xml:space="preserve"> (FK)</w:t>
+      </w:r>
     </w:p>
     <w:p>
       <w:pPr>
@@ -8506,14 +8614,619 @@
         <w:rPr>
           <w:b/>
           <w:bCs/>
-        </w:rPr>
-      </w:pPr>
+          <w:lang w:val="es-MX"/>
+        </w:rPr>
+      </w:pPr>
+      <w:proofErr w:type="spellStart"/>
       <w:r>
         <w:rPr>
           <w:b/>
           <w:bCs/>
+          <w:lang w:val="es-MX"/>
         </w:rPr>
         <w:lastRenderedPageBreak/>
+        <w:t>idUsuario</w:t>
+      </w:r>
+      <w:proofErr w:type="spellEnd"/>
+      <w:r>
+        <w:rPr>
+          <w:b/>
+          <w:bCs/>
+          <w:lang w:val="es-MX"/>
+        </w:rPr>
+        <w:t xml:space="preserve"> (FK)</w:t>
+      </w:r>
+    </w:p>
+    <w:p>
+      <w:pPr>
+        <w:spacing w:after="160" w:line="278" w:lineRule="auto"/>
+        <w:contextualSpacing w:val="0"/>
+        <w:rPr>
+          <w:b/>
+          <w:bCs/>
+          <w:lang w:val="es-MX"/>
+        </w:rPr>
+      </w:pPr>
+      <w:r>
+        <w:rPr>
+          <w:b/>
+          <w:bCs/>
+          <w:lang w:val="es-MX"/>
+        </w:rPr>
+        <w:t> </w:t>
+      </w:r>
+    </w:p>
+    <w:p>
+      <w:pPr>
+        <w:spacing w:after="160" w:line="278" w:lineRule="auto"/>
+        <w:contextualSpacing w:val="0"/>
+        <w:rPr>
+          <w:b/>
+          <w:bCs/>
+          <w:lang w:val="es-MX"/>
+        </w:rPr>
+      </w:pPr>
+      <w:r>
+        <w:rPr>
+          <w:b/>
+          <w:bCs/>
+          <w:lang w:val="es-MX"/>
+        </w:rPr>
+        <w:t>estado</w:t>
+      </w:r>
+    </w:p>
+    <w:p>
+      <w:pPr>
+        <w:spacing w:after="160" w:line="278" w:lineRule="auto"/>
+        <w:contextualSpacing w:val="0"/>
+        <w:rPr>
+          <w:b/>
+          <w:bCs/>
+          <w:lang w:val="es-MX"/>
+        </w:rPr>
+      </w:pPr>
+      <w:r>
+        <w:rPr>
+          <w:b/>
+          <w:bCs/>
+          <w:lang w:val="es-MX"/>
+        </w:rPr>
+        <w:t>comentario</w:t>
+      </w:r>
+    </w:p>
+    <w:p>
+      <w:pPr>
+        <w:spacing w:after="160" w:line="278" w:lineRule="auto"/>
+        <w:contextualSpacing w:val="0"/>
+        <w:rPr>
+          <w:b/>
+          <w:bCs/>
+          <w:lang w:val="es-MX"/>
+        </w:rPr>
+      </w:pPr>
+      <w:r>
+        <w:rPr>
+          <w:b/>
+          <w:bCs/>
+          <w:lang w:val="es-MX"/>
+        </w:rPr>
+        <w:t>Fecha</w:t>
+      </w:r>
+    </w:p>
+    <w:p>
+      <w:pPr>
+        <w:spacing w:after="160" w:line="278" w:lineRule="auto"/>
+        <w:contextualSpacing w:val="0"/>
+        <w:rPr>
+          <w:b/>
+          <w:bCs/>
+          <w:lang w:val="es-MX"/>
+        </w:rPr>
+      </w:pPr>
+      <w:r>
+        <w:rPr>
+          <w:b/>
+          <w:bCs/>
+          <w:lang w:val="es-MX"/>
+        </w:rPr>
+        <w:t> </w:t>
+      </w:r>
+    </w:p>
+    <w:p>
+      <w:pPr>
+        <w:spacing w:after="160" w:line="278" w:lineRule="auto"/>
+        <w:contextualSpacing w:val="0"/>
+        <w:rPr>
+          <w:b/>
+          <w:bCs/>
+          <w:lang w:val="es-MX"/>
+        </w:rPr>
+      </w:pPr>
+      <w:r>
+        <w:rPr>
+          <w:b/>
+          <w:bCs/>
+          <w:lang w:val="es-MX"/>
+        </w:rPr>
+        <w:t>Y solicitud falla</w:t>
+      </w:r>
+    </w:p>
+    <w:p>
+      <w:pPr>
+        <w:spacing w:after="160" w:line="278" w:lineRule="auto"/>
+        <w:contextualSpacing w:val="0"/>
+        <w:rPr>
+          <w:b/>
+          <w:bCs/>
+          <w:lang w:val="es-MX"/>
+        </w:rPr>
+      </w:pPr>
+      <w:r>
+        <w:rPr>
+          <w:b/>
+          <w:bCs/>
+          <w:lang w:val="es-MX"/>
+        </w:rPr>
+        <w:t> </w:t>
+      </w:r>
+    </w:p>
+    <w:p>
+      <w:pPr>
+        <w:spacing w:after="160" w:line="278" w:lineRule="auto"/>
+        <w:contextualSpacing w:val="0"/>
+        <w:rPr>
+          <w:b/>
+          <w:bCs/>
+        </w:rPr>
+      </w:pPr>
+      <w:r>
+        <w:rPr>
+          <w:b/>
+          <w:bCs/>
+        </w:rPr>
+        <w:t>SOLICITUD_FALLA</w:t>
+      </w:r>
+    </w:p>
+    <w:p>
+      <w:pPr>
+        <w:spacing w:after="160" w:line="278" w:lineRule="auto"/>
+        <w:contextualSpacing w:val="0"/>
+        <w:rPr>
+          <w:b/>
+          <w:bCs/>
+        </w:rPr>
+      </w:pPr>
+      <w:r>
+        <w:rPr>
+          <w:b/>
+          <w:bCs/>
+        </w:rPr>
+        <w:t>-------------------------</w:t>
+      </w:r>
+    </w:p>
+    <w:p>
+      <w:pPr>
+        <w:spacing w:after="160" w:line="278" w:lineRule="auto"/>
+        <w:contextualSpacing w:val="0"/>
+        <w:rPr>
+          <w:b/>
+          <w:bCs/>
+        </w:rPr>
+      </w:pPr>
+      <w:proofErr w:type="spellStart"/>
+      <w:r>
+        <w:rPr>
+          <w:b/>
+          <w:bCs/>
+        </w:rPr>
+        <w:t>idSolicitud</w:t>
+      </w:r>
+      <w:proofErr w:type="spellEnd"/>
+      <w:r>
+        <w:rPr>
+          <w:b/>
+          <w:bCs/>
+        </w:rPr>
+        <w:t xml:space="preserve"> (PK)</w:t>
+      </w:r>
+    </w:p>
+    <w:p>
+      <w:pPr>
+        <w:spacing w:after="160" w:line="278" w:lineRule="auto"/>
+        <w:contextualSpacing w:val="0"/>
+        <w:rPr>
+          <w:b/>
+          <w:bCs/>
+        </w:rPr>
+      </w:pPr>
+      <w:proofErr w:type="spellStart"/>
+      <w:r>
+        <w:rPr>
+          <w:b/>
+          <w:bCs/>
+        </w:rPr>
+        <w:t>idUsuario</w:t>
+      </w:r>
+      <w:proofErr w:type="spellEnd"/>
+      <w:r>
+        <w:rPr>
+          <w:b/>
+          <w:bCs/>
+        </w:rPr>
+        <w:t xml:space="preserve"> (FK)</w:t>
+      </w:r>
+    </w:p>
+    <w:p>
+      <w:pPr>
+        <w:spacing w:after="160" w:line="278" w:lineRule="auto"/>
+        <w:contextualSpacing w:val="0"/>
+        <w:rPr>
+          <w:b/>
+          <w:bCs/>
+        </w:rPr>
+      </w:pPr>
+      <w:proofErr w:type="spellStart"/>
+      <w:r>
+        <w:rPr>
+          <w:b/>
+          <w:bCs/>
+        </w:rPr>
+        <w:t>idActivo</w:t>
+      </w:r>
+      <w:proofErr w:type="spellEnd"/>
+      <w:r>
+        <w:rPr>
+          <w:b/>
+          <w:bCs/>
+        </w:rPr>
+        <w:t xml:space="preserve"> (FK)</w:t>
+      </w:r>
+    </w:p>
+    <w:p>
+      <w:pPr>
+        <w:spacing w:after="160" w:line="278" w:lineRule="auto"/>
+        <w:contextualSpacing w:val="0"/>
+        <w:rPr>
+          <w:b/>
+          <w:bCs/>
+          <w:lang w:val="es-MX"/>
+        </w:rPr>
+      </w:pPr>
+      <w:r>
+        <w:rPr>
+          <w:b/>
+          <w:bCs/>
+          <w:lang w:val="es-MX"/>
+        </w:rPr>
+        <w:t> </w:t>
+      </w:r>
+    </w:p>
+    <w:p>
+      <w:pPr>
+        <w:spacing w:after="160" w:line="278" w:lineRule="auto"/>
+        <w:contextualSpacing w:val="0"/>
+        <w:rPr>
+          <w:b/>
+          <w:bCs/>
+        </w:rPr>
+      </w:pPr>
+      <w:r>
+        <w:rPr>
+          <w:b/>
+          <w:bCs/>
+        </w:rPr>
+        <w:t>titulo</w:t>
+      </w:r>
+    </w:p>
+    <w:p>
+      <w:pPr>
+        <w:spacing w:after="160" w:line="278" w:lineRule="auto"/>
+        <w:contextualSpacing w:val="0"/>
+        <w:rPr>
+          <w:b/>
+          <w:bCs/>
+        </w:rPr>
+      </w:pPr>
+      <w:proofErr w:type="spellStart"/>
+      <w:r>
+        <w:rPr>
+          <w:b/>
+          <w:bCs/>
+        </w:rPr>
+        <w:t>descripcion</w:t>
+      </w:r>
+      <w:proofErr w:type="spellEnd"/>
+    </w:p>
+    <w:p>
+      <w:pPr>
+        <w:spacing w:after="160" w:line="278" w:lineRule="auto"/>
+        <w:contextualSpacing w:val="0"/>
+        <w:rPr>
+          <w:b/>
+          <w:bCs/>
+        </w:rPr>
+      </w:pPr>
+      <w:r>
+        <w:rPr>
+          <w:b/>
+          <w:bCs/>
+        </w:rPr>
+        <w:t>criticidad</w:t>
+      </w:r>
+    </w:p>
+    <w:p>
+      <w:pPr>
+        <w:spacing w:after="160" w:line="278" w:lineRule="auto"/>
+        <w:contextualSpacing w:val="0"/>
+        <w:rPr>
+          <w:b/>
+          <w:bCs/>
+        </w:rPr>
+      </w:pPr>
+      <w:r>
+        <w:rPr>
+          <w:b/>
+          <w:bCs/>
+        </w:rPr>
+        <w:t>estado</w:t>
+      </w:r>
+    </w:p>
+    <w:p>
+      <w:pPr>
+        <w:spacing w:after="160" w:line="278" w:lineRule="auto"/>
+        <w:contextualSpacing w:val="0"/>
+        <w:rPr>
+          <w:b/>
+          <w:bCs/>
+          <w:lang w:val="es-MX"/>
+        </w:rPr>
+      </w:pPr>
+      <w:r>
+        <w:rPr>
+          <w:b/>
+          <w:bCs/>
+          <w:lang w:val="es-MX"/>
+        </w:rPr>
+        <w:t> </w:t>
+      </w:r>
+    </w:p>
+    <w:p>
+      <w:pPr>
+        <w:spacing w:after="160" w:line="278" w:lineRule="auto"/>
+        <w:contextualSpacing w:val="0"/>
+        <w:rPr>
+          <w:b/>
+          <w:bCs/>
+        </w:rPr>
+      </w:pPr>
+      <w:proofErr w:type="spellStart"/>
+      <w:r>
+        <w:rPr>
+          <w:b/>
+          <w:bCs/>
+        </w:rPr>
+        <w:t>fechaCreacion</w:t>
+      </w:r>
+      <w:proofErr w:type="spellEnd"/>
+    </w:p>
+    <w:p>
+      <w:pPr>
+        <w:spacing w:after="160" w:line="278" w:lineRule="auto"/>
+        <w:contextualSpacing w:val="0"/>
+        <w:rPr>
+          <w:b/>
+          <w:bCs/>
+        </w:rPr>
+      </w:pPr>
+      <w:proofErr w:type="spellStart"/>
+      <w:r>
+        <w:rPr>
+          <w:b/>
+          <w:bCs/>
+        </w:rPr>
+        <w:t>fechaActualizacion</w:t>
+      </w:r>
+      <w:proofErr w:type="spellEnd"/>
+    </w:p>
+    <w:p>
+      <w:pPr>
+        <w:spacing w:after="160" w:line="278" w:lineRule="auto"/>
+        <w:contextualSpacing w:val="0"/>
+        <w:rPr>
+          <w:b/>
+          <w:bCs/>
+        </w:rPr>
+      </w:pPr>
+      <w:proofErr w:type="spellStart"/>
+      <w:r>
+        <w:rPr>
+          <w:b/>
+          <w:bCs/>
+        </w:rPr>
+        <w:t>fechaCierre</w:t>
+      </w:r>
+      <w:proofErr w:type="spellEnd"/>
+    </w:p>
+    <w:p>
+      <w:pPr>
+        <w:spacing w:after="160" w:line="278" w:lineRule="auto"/>
+        <w:contextualSpacing w:val="0"/>
+        <w:rPr>
+          <w:b/>
+          <w:bCs/>
+          <w:lang w:val="es-MX"/>
+        </w:rPr>
+      </w:pPr>
+      <w:r>
+        <w:rPr>
+          <w:b/>
+          <w:bCs/>
+          <w:lang w:val="es-MX"/>
+        </w:rPr>
+        <w:t> </w:t>
+      </w:r>
+    </w:p>
+    <w:p>
+      <w:pPr>
+        <w:spacing w:after="160" w:line="278" w:lineRule="auto"/>
+        <w:contextualSpacing w:val="0"/>
+        <w:rPr>
+          <w:b/>
+          <w:bCs/>
+        </w:rPr>
+      </w:pPr>
+      <w:proofErr w:type="spellStart"/>
+      <w:r>
+        <w:rPr>
+          <w:b/>
+          <w:bCs/>
+        </w:rPr>
+        <w:t>trabajoRealizado</w:t>
+      </w:r>
+      <w:proofErr w:type="spellEnd"/>
+    </w:p>
+    <w:p>
+      <w:pPr>
+        <w:spacing w:after="160" w:line="278" w:lineRule="auto"/>
+        <w:contextualSpacing w:val="0"/>
+        <w:rPr>
+          <w:b/>
+          <w:bCs/>
+        </w:rPr>
+      </w:pPr>
+      <w:proofErr w:type="spellStart"/>
+      <w:r>
+        <w:rPr>
+          <w:b/>
+          <w:bCs/>
+        </w:rPr>
+        <w:t>repuestosUtilizados</w:t>
+      </w:r>
+      <w:proofErr w:type="spellEnd"/>
+    </w:p>
+    <w:p>
+      <w:pPr>
+        <w:spacing w:after="160" w:line="278" w:lineRule="auto"/>
+        <w:contextualSpacing w:val="0"/>
+        <w:rPr>
+          <w:b/>
+          <w:bCs/>
+        </w:rPr>
+      </w:pPr>
+      <w:proofErr w:type="spellStart"/>
+      <w:r>
+        <w:rPr>
+          <w:b/>
+          <w:bCs/>
+        </w:rPr>
+        <w:t>observacionesCierre</w:t>
+      </w:r>
+      <w:proofErr w:type="spellEnd"/>
+    </w:p>
+    <w:p>
+      <w:pPr>
+        <w:spacing w:after="160" w:line="278" w:lineRule="auto"/>
+        <w:contextualSpacing w:val="0"/>
+        <w:rPr>
+          <w:b/>
+          <w:bCs/>
+        </w:rPr>
+      </w:pPr>
+    </w:p>
+    <w:p>
+      <w:pPr>
+        <w:spacing w:after="160" w:line="278" w:lineRule="auto"/>
+        <w:contextualSpacing w:val="0"/>
+        <w:rPr>
+          <w:b/>
+          <w:bCs/>
+        </w:rPr>
+      </w:pPr>
+    </w:p>
+    <w:p>
+      <w:pPr>
+        <w:spacing w:after="160" w:line="278" w:lineRule="auto"/>
+        <w:contextualSpacing w:val="0"/>
+        <w:rPr>
+          <w:b/>
+          <w:bCs/>
+        </w:rPr>
+      </w:pPr>
+    </w:p>
+    <w:p>
+      <w:pPr>
+        <w:spacing w:after="160" w:line="278" w:lineRule="auto"/>
+        <w:contextualSpacing w:val="0"/>
+        <w:rPr>
+          <w:b/>
+          <w:bCs/>
+        </w:rPr>
+      </w:pPr>
+    </w:p>
+    <w:p>
+      <w:pPr>
+        <w:spacing w:after="160" w:line="278" w:lineRule="auto"/>
+        <w:contextualSpacing w:val="0"/>
+        <w:rPr>
+          <w:b/>
+          <w:bCs/>
+        </w:rPr>
+      </w:pPr>
+    </w:p>
+    <w:p>
+      <w:pPr>
+        <w:spacing w:after="160" w:line="278" w:lineRule="auto"/>
+        <w:contextualSpacing w:val="0"/>
+        <w:rPr>
+          <w:b/>
+          <w:bCs/>
+        </w:rPr>
+      </w:pPr>
+    </w:p>
+    <w:p>
+      <w:pPr>
+        <w:spacing w:after="160" w:line="278" w:lineRule="auto"/>
+        <w:contextualSpacing w:val="0"/>
+        <w:rPr>
+          <w:b/>
+          <w:bCs/>
+        </w:rPr>
+      </w:pPr>
+    </w:p>
+    <w:p>
+      <w:pPr>
+        <w:spacing w:after="160" w:line="278" w:lineRule="auto"/>
+        <w:contextualSpacing w:val="0"/>
+        <w:rPr>
+          <w:b/>
+          <w:bCs/>
+        </w:rPr>
+      </w:pPr>
+    </w:p>
+    <w:p>
+      <w:pPr>
+        <w:spacing w:after="160" w:line="278" w:lineRule="auto"/>
+        <w:contextualSpacing w:val="0"/>
+        <w:rPr>
+          <w:b/>
+          <w:bCs/>
+        </w:rPr>
+      </w:pPr>
+    </w:p>
+    <w:p>
+      <w:pPr>
+        <w:spacing w:after="160" w:line="278" w:lineRule="auto"/>
+        <w:contextualSpacing w:val="0"/>
+        <w:rPr>
+          <w:b/>
+          <w:bCs/>
+        </w:rPr>
+      </w:pPr>
+      <w:r>
+        <w:rPr>
+          <w:b/>
+          <w:bCs/>
+        </w:rPr>
         <w:t>CONCLUSION.</w:t>
       </w:r>
     </w:p>
@@ -9840,7 +10553,6 @@
   <w:style w:type="character" w:default="1" w:styleId="Fuentedeprrafopredeter">
     <w:name w:val="Default Paragraph Font"/>
     <w:uiPriority w:val="1"/>
-    <w:semiHidden/>
     <w:unhideWhenUsed/>
   </w:style>
   <w:style w:type="table" w:default="1" w:styleId="Tablanormal">

</xml_diff>